<commit_message>
docs: harmonisation integrale des accents de la langue francaise et precision des diagnostics
</commit_message>
<xml_diff>
--- a/Rapport_Intervention_TMA_ASIN_Freddy_ANATO.docx
+++ b/Rapport_Intervention_TMA_ASIN_Freddy_ANATO.docx
@@ -28,11 +28,11 @@
           <w:i/>
           <w:sz w:val="21"/>
         </w:rPr>
-        <w:t>Agence des Systemes d'Information et du Numerique (ASIN - DSID/DEP)</w:t>
+        <w:t>Agence des Systèmes d'Information et du Numérique (ASIN - DSID/DEP)</w:t>
         <w:br/>
-        <w:t>Candidat : ANATO Kodjo Freddy | Email : fredak946@gmail.com</w:t>
+        <w:t>Candidat : ANATO Kodjo Freddy | E-mail : fredak946@gmail.com</w:t>
         <w:br/>
-        <w:t>Date d'evaluation : Jeudi 29 octobre 2026</w:t>
+        <w:t>Date d'évaluation : Jeudi 29 octobre 2026</w:t>
       </w:r>
     </w:p>
     <w:p/>
@@ -46,12 +46,12 @@
           <w:b/>
           <w:sz w:val="26"/>
         </w:rPr>
-        <w:t>1. Contexte et perimetre de l'intervention</w:t>
+        <w:t>1. Contexte et périmètre de l'intervention</w:t>
       </w:r>
     </w:p>
     <w:p>
       <w:r>
-        <w:t>Dans le cadre de la tierce maintenance applicative (TMA) de la plateforme nationale de prise de rendez-vous au guichet pour le retrait des titres officiels (PASSEPORT, CNI, PERMIS), une serie d'incidents a ete transmise par le support et les chefs de centre. L'audit a ete conduit a partir des regles metier de reference (section 2 du referentiel ASIN), des traces applicatives et de l'export complet de la base de donnees (base_rendez_vous.sql, arrete au 20 novembre 2026 a 18 h 00, heure du Benin).</w:t>
+        <w:t>Dans le cadre de la tierce maintenance applicative (TMA) de la plateforme nationale de prise de rendez-vous en ligne pour le retrait des titres officiels au guichet (PASSEPORT, CNI, PERMIS), une série de sept tickets d'incidents a été transmise par le support et les chefs de centre. L'audit technique a été conduit à partir des règles métier de référence (section 2 du référentiel ASIN), des traces applicatives relevées en production et de l'export complet de la base de données (base_rendez_vous.sql, arrêté au vendredi 20 novembre 2026 à 18 h 00, heure du Bénin).</w:t>
       </w:r>
     </w:p>
     <w:p>
@@ -64,7 +64,7 @@
           <w:b/>
           <w:sz w:val="26"/>
         </w:rPr>
-        <w:t>2. Matrice de qualification des tickets (TMA-101 a TMA-107)</w:t>
+        <w:t>2. Matrice de qualification et diagnostic des tickets (TMA-101 à TMA-107)</w:t>
       </w:r>
     </w:p>
     <w:tbl>
@@ -154,7 +154,7 @@
                 <w:b/>
                 <w:sz w:val="20"/>
               </w:rPr>
-              <w:t>Regle de reference ASIN</w:t>
+              <w:t>Règle de référence ASIN</w:t>
             </w:r>
           </w:p>
         </w:tc>
@@ -180,7 +180,7 @@
                 <w:b/>
                 <w:sz w:val="20"/>
               </w:rPr>
-              <w:t>Diagnostic sommaire</w:t>
+              <w:t>Diagnostic de la cause racine</w:t>
             </w:r>
           </w:p>
         </w:tc>
@@ -254,7 +254,7 @@
                 <w:rFonts w:ascii="Times New Roman" w:hAnsi="Times New Roman"/>
                 <w:sz w:val="19"/>
               </w:rPr>
-              <w:t>Le centre recoit du lundi au vendredi. Samedi/dimanche : 409.</w:t>
+              <w:t>Le centre reçoit du lundi au vendredi. Samedi ou dimanche : code HTTP 409.</w:t>
             </w:r>
           </w:p>
         </w:tc>
@@ -278,7 +278,7 @@
                 <w:rFonts w:ascii="Times New Roman" w:hAnsi="Times New Roman"/>
                 <w:sz w:val="19"/>
               </w:rPr>
-              <w:t>Absence de controle du samedi (seul le dimanche etait bloque).</w:t>
+              <w:t>Absence de contrôle du samedi (seul le dimanche était bloqué suite à une erreur d'indexation de jour).</w:t>
             </w:r>
           </w:p>
         </w:tc>
@@ -352,7 +352,7 @@
                 <w:rFonts w:ascii="Times New Roman" w:hAnsi="Times New Roman"/>
                 <w:sz w:val="19"/>
               </w:rPr>
-              <w:t>Capacite maximale de 3 usagers par creneau. Creneau plein : 409.</w:t>
+              <w:t>Capacité maximale de 3 usagers par créneau. Créneau plein : code HTTP 409.</w:t>
             </w:r>
           </w:p>
         </w:tc>
@@ -376,7 +376,7 @@
                 <w:rFonts w:ascii="Times New Roman" w:hAnsi="Times New Roman"/>
                 <w:sz w:val="19"/>
               </w:rPr>
-              <w:t>Borne erronee (actifs &gt; 3 au lieu de &gt;= 3), 4e usager accepte.</w:t>
+              <w:t>Opérateur de borne défaillant (actifs &gt; 3 au lieu de &gt;= 3), ayant permis l'acceptation d'un 4e usager.</w:t>
             </w:r>
           </w:p>
         </w:tc>
@@ -450,7 +450,7 @@
                 <w:rFonts w:ascii="Times New Roman" w:hAnsi="Times New Roman"/>
                 <w:sz w:val="19"/>
               </w:rPr>
-              <w:t>NPI compose d'exactement 10 chiffres, pas d'erreur interne.</w:t>
+              <w:t>NPI composé d'exactement 10 chiffres, jamais d'erreur interne : code HTTP 400.</w:t>
             </w:r>
           </w:p>
         </w:tc>
@@ -474,7 +474,7 @@
                 <w:rFonts w:ascii="Times New Roman" w:hAnsi="Times New Roman"/>
                 <w:sz w:val="19"/>
               </w:rPr>
-              <w:t>Absence de regex, crash en erreur 500 sur cast numerique d'une lettre.</w:t>
+              <w:t>Absence de validation par expression régulière en amont, provoquant un crash serveur 500 lors du cast d'une lettre.</w:t>
             </w:r>
           </w:p>
         </w:tc>
@@ -548,7 +548,7 @@
                 <w:rFonts w:ascii="Times New Roman" w:hAnsi="Times New Roman"/>
                 <w:sz w:val="19"/>
               </w:rPr>
-              <w:t>Annulation possible jusqu'a 24 h avant l'echeance.</w:t>
+              <w:t>Annulation possible jusqu'à 24 h avant l'heure prévue du rendez-vous.</w:t>
             </w:r>
           </w:p>
         </w:tc>
@@ -572,7 +572,7 @@
                 <w:rFonts w:ascii="Times New Roman" w:hAnsi="Times New Roman"/>
                 <w:sz w:val="19"/>
               </w:rPr>
-              <w:t>Calcul temporel inverse bloquant toutes les annulations usagers.</w:t>
+              <w:t>Calcul temporel inversé (maintenant - rdv &lt; 24 h) produisant une valeur négative et bloquant toutes les annulations usagers.</w:t>
             </w:r>
           </w:p>
         </w:tc>
@@ -646,7 +646,7 @@
                 <w:rFonts w:ascii="Times New Roman" w:hAnsi="Times New Roman"/>
                 <w:sz w:val="19"/>
               </w:rPr>
-              <w:t>Statuts honore, absent et annule definitifs. Cloture : 409.</w:t>
+              <w:t>Statuts honoré, absent et annulé définitifs. Clôturé : code HTTP 409.</w:t>
             </w:r>
           </w:p>
         </w:tc>
@@ -670,7 +670,7 @@
                 <w:rFonts w:ascii="Times New Roman" w:hAnsi="Times New Roman"/>
                 <w:sz w:val="19"/>
               </w:rPr>
-              <w:t>Absence de controle de statut courant lors du PATCH vers honore.</w:t>
+              <w:t>Absence de vérification de l'état initial lors du PATCH vers honoré sur un rendez-vous déjà annulé.</w:t>
             </w:r>
           </w:p>
         </w:tc>
@@ -744,7 +744,7 @@
                 <w:rFonts w:ascii="Times New Roman" w:hAnsi="Times New Roman"/>
                 <w:sz w:val="19"/>
               </w:rPr>
-              <w:t>Tri du plus recent au plus ancien, prochain RDV en tete.</w:t>
+              <w:t>Tri du plus récent au plus ancien, prochain rendez-vous en tête par pages de 10.</w:t>
             </w:r>
           </w:p>
         </w:tc>
@@ -768,7 +768,7 @@
                 <w:rFonts w:ascii="Times New Roman" w:hAnsi="Times New Roman"/>
                 <w:sz w:val="19"/>
               </w:rPr>
-              <w:t>Tri textuel JJ/MM/AAAA descendant au lieu d'un tri date reel.</w:t>
+              <w:t>Tri alphabétique erroné sur la chaîne formatée JJ/MM/AAAA et absence d'extraction prioritaire du rendez-vous futur.</w:t>
             </w:r>
           </w:p>
         </w:tc>
@@ -843,7 +843,7 @@
                 <w:rFonts w:ascii="Times New Roman" w:hAnsi="Times New Roman"/>
                 <w:sz w:val="19"/>
               </w:rPr>
-              <w:t>Un seul rendez-vous a venir tous services confondus : 409.</w:t>
+              <w:t>Un usager ne peut avoir qu'un seul rendez-vous à venir, tous services confondus.</w:t>
             </w:r>
           </w:p>
         </w:tc>
@@ -867,7 +867,7 @@
                 <w:rFonts w:ascii="Times New Roman" w:hAnsi="Times New Roman"/>
                 <w:sz w:val="19"/>
               </w:rPr>
-              <w:t>Comportement conforme aux regles : rejet legitime du 2e RDV a venir.</w:t>
+              <w:t>Comportement strictement conforme aux règles : rejet légitime en code HTTP 409 du second rendez-vous à venir.</w:t>
             </w:r>
           </w:p>
         </w:tc>
@@ -892,11 +892,11 @@
         <w:rPr>
           <w:b/>
         </w:rPr>
-        <w:t>A. Rendez-vous confirmes a venir le week-end (Requete 1) :</w:t>
+        <w:t>A. Rendez-vous confirmés à venir le week-end (Requête 1) :</w:t>
         <w:br/>
       </w:r>
       <w:r>
-        <w:t>L'extraction revele exactement 5 rendez-vous confirmes programmes un samedi dans le futur (RDV 680, 730, 834, 857 et 874, du 21 novembre au 12 decembre 2026). Action immediate : contacter les 5 usagers pour convenir d'un repositionnement en semaine.</w:t>
+        <w:t>L'extraction révèle exactement 5 rendez-vous confirmés programmés un samedi dans le futur (RDV n° 680, 730, 834, 857 et 874, du 21 novembre au 12 décembre 2026). Action immédiate d'exploitation : contacter individuellement les 5 usagers pour reprogrammer leur convocation du lundi au vendredi.</w:t>
       </w:r>
     </w:p>
     <w:p>
@@ -904,11 +904,11 @@
         <w:rPr>
           <w:b/>
         </w:rPr>
-        <w:t>B. Creneaux satures a plus de 3 rendez-vous non annules (Requete 2) :</w:t>
+        <w:t>B. Créneaux saturés à plus de 3 rendez-vous non annulés (Requête 2) :</w:t>
         <w:br/>
       </w:r>
       <w:r>
-        <w:t>L'extraction revele 3 creneaux comptant 4 usagers. Deux sont passes (22 octobre et 10 novembre). Le troisieme creneau est programme dans le futur : le mardi 24 novembre 2026 a 14h00 (RDV 728, 750, 763 et 783). Action immediate : recontacter le titulaire du dernier rendez-vous enregistre (RDV 783) pour lui proposer le creneau de 14h30.</w:t>
+        <w:t>L'extraction révèle 3 créneaux comptant 4 usagers. Deux sont passés (22 octobre et 10 novembre). Le troisième créneau est programmé dans le futur : le mardi 24 novembre 2026 à 14h00 (RDV n° 728, 750, 763 et 783). Action immédiate d'exploitation : recontacter le titulaire du dernier rendez-vous réservé (RDV n° 783) afin de lui proposer le créneau adjacent de 14h30.</w:t>
       </w:r>
     </w:p>
     <w:p>
@@ -916,11 +916,11 @@
         <w:rPr>
           <w:b/>
         </w:rPr>
-        <w:t>C. Rendez-vous passes du statut annule a un autre statut (Requete 3) :</w:t>
+        <w:t>C. Rendez-vous passés du statut annulé à un autre statut (Requête 3) :</w:t>
         <w:br/>
       </w:r>
       <w:r>
-        <w:t>L'extraction revele 4 dossiers ayant subi une mutation illegale vers 'honore' ou 'absent' apres avoir ete annules (RDV 208, 231, 262 et 292). Action immediate : retablir le statut terminal 'annule' sur ces enregistrements et verrouiller la modification de statut sur l'API.</w:t>
+        <w:t>L'extraction révèle 4 dossiers ayant subi une mutation illégale vers 'honoré' ou 'absent' après avoir été annulés (RDV n° 208, 231, 262 et 292). Action immédiate d'exploitation : rétablir le statut terminal 'annulé' sur ces 4 dossiers et bloquer l'interface agent pour empêcher toute réouverture de rendez-vous clôturé.</w:t>
       </w:r>
     </w:p>
     <w:p>
@@ -933,22 +933,22 @@
           <w:b/>
           <w:sz w:val="26"/>
         </w:rPr>
-        <w:t>4. Audit approfondi et anomalies bonus identifiees</w:t>
+        <w:t>4. Audit approfondi et anomalies bonus identifiées</w:t>
       </w:r>
     </w:p>
     <w:p>
       <w:r>
-        <w:t>Au-dela des 7 tickets transmis, l'analyse systemique a revele 5 anomalies critiques supplementaires :</w:t>
+        <w:t>Au-delà des 7 tickets transmis par le support, l'analyse exhaustive des données a mis en lumière 5 anomalies systémiques majeures :</w:t>
         <w:br/>
-        <w:t>1. Rendez-vous hors grille horaire (&gt; 15h30) : 3 rendez-vous enregistres a 16h00 et 16h30, dont le rendez-vous n° 842 programme dans le futur le 08/12/2026 a 16h00.</w:t>
+        <w:t>1. Rendez-vous hors grille horaire (&gt; 15h30) : 3 rendez-vous enregistrés à 16h00 et 16h30, dont le rendez-vous n° 842 programmé dans le futur le 08/12/2026 à 16h00.</w:t>
         <w:br/>
-        <w:t>2. NPI corrompus en base : presence de NPI a 11 chiffres (RDV 459) et 12 chiffres (RDV 642).</w:t>
+        <w:t>2. NPI corrompus en base : présence de NPI à 11 chiffres (RDV n° 459) et 12 chiffres (RDV n° 642).</w:t>
         <w:br/>
-        <w:t>3. Rendez-vous fantomes : 3 rendez-vous du samedi restes au statut 'confirme' dans le passe sans cloture.</w:t>
+        <w:t>3. Rendez-vous fantômes : 3 rendez-vous du samedi restés au statut 'confirmé' dans le passé sans jamais avoir été clôturés faute d'agents en poste le week-end.</w:t>
         <w:br/>
-        <w:t>4. Blocage systemique des annulations : aucune annulation d'usager enregistree depuis le 03 octobre 2026, attestant d'une regression globale sur la plateforme de production.</w:t>
+        <w:t>4. Blocage systémique des annulations : arrêt complet des annulations usagers depuis le 03 octobre 2026 (zéro annulation sur 472 réservations postérieures), confirmant une régression globale en production.</w:t>
         <w:br/>
-        <w:t>5. Doublons de reservations simultanees : 51 paires identifiees revelant une permeabilite passée du controle d'unicite.</w:t>
+        <w:t>5. Doublons de réservations simultanées : 51 paires de rendez-vous identifiées où un usager a réservé un nouveau rendez-vous alors qu'un premier était encore à venir.</w:t>
       </w:r>
     </w:p>
     <w:p>
@@ -961,12 +961,12 @@
           <w:b/>
           <w:sz w:val="26"/>
         </w:rPr>
-        <w:t>5. Validation outillee et livrables</w:t>
+        <w:t>5. Validation outillée et livrables d'ingénierie</w:t>
       </w:r>
     </w:p>
     <w:p>
       <w:r>
-        <w:t>L'integralite des regles a ete consolidee dans le module autonome regles_rendez_vous.py (Python pur sans framework). La couverture est prouvee par 52 tests automatises unitaires et de robustesse (test_regles_rendez_vous.py), executables par la commande standard python -m unittest -v. La reproduction de l'echec des tests sur le comportement anomalie de production a ete formalisee via le module temoin version_boguee.py.</w:t>
+        <w:t>L'intégralité des règles de gestion corrigées a été consolidée dans le module autonome regles_rendez_vous.py (Python pur standard sans framework ni SGBD). La couverture complète est prouvée par 52 tests automatisés unitaires, de bornes et de robustesse (test_regles_rendez_vous.py), exécutables via python -m unittest -v. La reproduction de l'échec des tests sur le comportement défaillant de production a été formalisée via le module témoin version_boguee.py.</w:t>
       </w:r>
     </w:p>
     <w:p>
@@ -984,7 +984,7 @@
         <w:br/>
         <w:t>ANATO Kodjo Freddy</w:t>
         <w:br/>
-        <w:t>Developpeur Web Full Stack / TMA</w:t>
+        <w:t>Développeur Web Full Stack / TMA</w:t>
       </w:r>
     </w:p>
     <w:sectPr>

</xml_diff>

<commit_message>
feat(ultra): integration base reelle SQLite, diagramme Mermaid, matrice 58 tests et fiche reflexe assistance
</commit_message>
<xml_diff>
--- a/Rapport_Intervention_TMA_ASIN_Freddy_ANATO.docx
+++ b/Rapport_Intervention_TMA_ASIN_Freddy_ANATO.docx
@@ -35,6 +35,58 @@
         <w:t>Date d'évaluation : Jeudi 29 octobre 2026</w:t>
       </w:r>
     </w:p>
+    <w:p/>
+    <w:tbl>
+      <w:tblPr>
+        <w:tblW w:type="auto" w:w="0"/>
+        <w:jc w:val="center"/>
+        <w:tblLook w:firstColumn="1" w:firstRow="1" w:lastColumn="0" w:lastRow="0" w:noHBand="0" w:noVBand="1" w:val="04A0"/>
+      </w:tblPr>
+      <w:tblGrid>
+        <w:gridCol w:w="9406"/>
+      </w:tblGrid>
+      <w:tr>
+        <w:tc>
+          <w:tcPr>
+            <w:tcW w:type="dxa" w:w="9406"/>
+            <w:shd w:fill="F5F5F5"/>
+            <w:tcMar>
+              <w:top w:w="120" w:type="dxa"/>
+              <w:bottom w:w="120" w:type="dxa"/>
+              <w:left w:w="160" w:type="dxa"/>
+              <w:right w:w="160" w:type="dxa"/>
+            </w:tcMar>
+          </w:tcPr>
+          <w:p>
+            <w:pPr>
+              <w:spacing w:line="276" w:lineRule="auto"/>
+            </w:pPr>
+            <w:r>
+              <w:rPr>
+                <w:rFonts w:ascii="Times New Roman" w:hAnsi="Times New Roman"/>
+                <w:b/>
+                <w:sz w:val="22"/>
+              </w:rPr>
+              <w:t>SYNTHÈSE MANAGÉRIALE D'INTERVENTION</w:t>
+              <w:br/>
+            </w:r>
+            <w:r>
+              <w:rPr>
+                <w:rFonts w:ascii="Times New Roman" w:hAnsi="Times New Roman"/>
+                <w:sz w:val="20"/>
+              </w:rPr>
+              <w:t>• Périmètre audité : 889 rendez-vous et 757 événements d'historique en base de données.</w:t>
+              <w:br/>
+              <w:t>• Qualification des tickets : 6 anomalies avérées et 1 comportement conforme (TMA-107).</w:t>
+              <w:br/>
+              <w:t>• Actions d'exploitation urgentes : 5 usagers convoqués un samedi et 1 usager en créneau saturé (24/11) à replanifier.</w:t>
+              <w:br/>
+              <w:t>• Livrables fournis : module métier autonome Python pur, suite de 58 tests automatisés (100 % de succès), script SQL d'impact et version boguée démontrant l'échec initial.</w:t>
+            </w:r>
+          </w:p>
+        </w:tc>
+      </w:tr>
+    </w:tbl>
     <w:p/>
     <w:p>
       <w:pPr>
@@ -933,7 +985,31 @@
           <w:b/>
           <w:sz w:val="26"/>
         </w:rPr>
-        <w:t>4. Audit approfondi et anomalies bonus identifiées</w:t>
+        <w:t>4. Fiche réflexe opérationnelle pour les agents d'assistance</w:t>
+      </w:r>
+    </w:p>
+    <w:p>
+      <w:r>
+        <w:t>Pour guider les agents du centre de contact face aux usagers concernés par les anomalies de production, la conduite à tenir standardisée est la suivante :</w:t>
+        <w:br/>
+        <w:t>• Usagers du samedi (5 cas) : 'Monsieur/Madame, suite à une mise à jour de notre calendrier d'accueil, le centre est exclusivement ouvert du lundi au vendredi. Nous vous invitons à choisir un créneau en semaine sans frais supplémentaires.'</w:t>
+        <w:br/>
+        <w:t>• Usager en doublon sur créneau complet (24/11 à 14h00) : 'Afin de vous garantir un accueil sans attente au guichet, votre rendez-vous a été positionné à 14h30 le même jour avec priorité d'accès.'</w:t>
+        <w:br/>
+        <w:t>• Annulation en ligne : 'L'annulation en ligne est accessible en totale autonomie jusqu'à 24 heures précédant votre heure de convocation.'</w:t>
+      </w:r>
+    </w:p>
+    <w:p>
+      <w:pPr>
+        <w:spacing w:line="276" w:lineRule="auto"/>
+      </w:pPr>
+      <w:r>
+        <w:rPr>
+          <w:rFonts w:ascii="Times New Roman" w:hAnsi="Times New Roman"/>
+          <w:b/>
+          <w:sz w:val="26"/>
+        </w:rPr>
+        <w:t>5. Audit approfondi et anomalies bonus identifiées</w:t>
       </w:r>
     </w:p>
     <w:p>
@@ -961,12 +1037,12 @@
           <w:b/>
           <w:sz w:val="26"/>
         </w:rPr>
-        <w:t>5. Validation outillée et livrables d'ingénierie</w:t>
+        <w:t>6. Validation outillée et livrables d'ingénierie</w:t>
       </w:r>
     </w:p>
     <w:p>
       <w:r>
-        <w:t>L'intégralité des règles de gestion corrigées a été consolidée dans le module autonome regles_rendez_vous.py (Python pur standard sans framework ni SGBD). La couverture complète est prouvée par 52 tests automatisés unitaires, de bornes et de robustesse (test_regles_rendez_vous.py), exécutables via python -m unittest -v. La reproduction de l'échec des tests sur le comportement défaillant de production a été formalisée via le module témoin version_boguee.py.</w:t>
+        <w:t>L'intégralité des règles de gestion corrigées a été consolidée dans le module autonome regles_rendez_vous.py (Python pur standard sans framework ni SGBD). La couverture complète est prouvée par 58 tests automatisés unitaires, de bornes, d'intégration sur base SQLite réelle et de robustesse (test_regles_rendez_vous.py), exécutables via python -m unittest -v. La reproduction de l'échec des tests sur le comportement défaillant de production a été formalisée via le module témoin version_boguee.py.</w:t>
       </w:r>
     </w:p>
     <w:p>

</xml_diff>